<commit_message>
near complete with final modifications left
</commit_message>
<xml_diff>
--- a/task1.docx
+++ b/task1.docx
@@ -1508,7 +1508,13 @@
     </w:p>
     <w:p>
       <w:r>
-        <w:t>Features were selected based on domain knowledge and the correlation matrix,</w:t>
+        <w:t>Features were selected based on domain knowledge</w:t>
+      </w:r>
+      <w:r>
+        <w:t xml:space="preserve">, and substantiated using the </w:t>
+      </w:r>
+      <w:r>
+        <w:t>correlation matrix,</w:t>
       </w:r>
       <w:r>
         <w:t xml:space="preserve"> </w:t>
@@ -1669,16 +1675,28 @@
         <w:t xml:space="preserve">The silhouette scores </w:t>
       </w:r>
       <w:r>
-        <w:t>were</w:t>
-      </w:r>
-      <w:r>
-        <w:t xml:space="preserve"> marginally improved through </w:t>
+        <w:t xml:space="preserve">showed a marginal improvement across the board </w:t>
+      </w:r>
+      <w:r>
+        <w:t xml:space="preserve">through </w:t>
       </w:r>
       <w:r>
         <w:t>feature</w:t>
       </w:r>
       <w:r>
-        <w:t xml:space="preserve"> selection with scores of</w:t>
+        <w:t xml:space="preserve"> selection</w:t>
+      </w:r>
+      <w:r>
+        <w:t xml:space="preserve">, </w:t>
+      </w:r>
+      <w:r>
+        <w:t xml:space="preserve">though </w:t>
+      </w:r>
+      <w:r>
+        <w:t>decreased for k=4,</w:t>
+      </w:r>
+      <w:r>
+        <w:t xml:space="preserve"> with scores of</w:t>
       </w:r>
       <w:r>
         <w:t xml:space="preserve"> </w:t>
@@ -1716,20 +1734,14 @@
       <w:r>
         <w:t xml:space="preserve">). </w:t>
       </w:r>
-      <w:r>
-        <w:t xml:space="preserve">The silhouette score </w:t>
-      </w:r>
-      <w:r>
-        <w:t>is</w:t>
-      </w:r>
-      <w:r>
-        <w:t xml:space="preserve"> </w:t>
-      </w:r>
-      <w:r>
-        <w:t xml:space="preserve">weak overall which indicates </w:t>
-      </w:r>
-      <w:r>
-        <w:t xml:space="preserve">poor separation between clusters. </w:t>
+    </w:p>
+    <w:p>
+      <w:r>
+        <w:lastRenderedPageBreak/>
+        <w:t xml:space="preserve">Although reducing the number of features showed some improvement in clustering performance, </w:t>
+      </w:r>
+      <w:r>
+        <w:t xml:space="preserve">the silhouette score remained low, indicating weak cluster separation and substantial overlap. </w:t>
       </w:r>
     </w:p>
     <w:p>
@@ -1747,7 +1759,6 @@
     </w:p>
     <w:p>
       <w:r>
-        <w:lastRenderedPageBreak/>
         <w:t xml:space="preserve">The summary of cluster membership and centroid values are displayed in table 1.3. The model produced an inertia of </w:t>
       </w:r>
       <w:r>
@@ -1763,13 +1774,13 @@
         <w:t xml:space="preserve">. </w:t>
       </w:r>
       <w:r>
-        <w:t xml:space="preserve">The centroid values </w:t>
-      </w:r>
-      <w:r>
-        <w:t>suggest</w:t>
-      </w:r>
-      <w:r>
-        <w:t xml:space="preserve"> overlap in chemical properties, a potential indicator that the clusters aren’t clearly separated. </w:t>
+        <w:t>Some of the centroid values seem to overlap</w:t>
+      </w:r>
+      <w:r>
+        <w:t xml:space="preserve">, </w:t>
+      </w:r>
+      <w:r>
+        <w:t xml:space="preserve">a potential indicator that the clusters aren’t clearly separated. </w:t>
       </w:r>
     </w:p>
     <w:tbl>
@@ -2519,16 +2530,10 @@
         <w:t xml:space="preserve">ed some separation among </w:t>
       </w:r>
       <w:r>
-        <w:t xml:space="preserve">clusters </w:t>
-      </w:r>
-      <w:r>
-        <w:t xml:space="preserve">though </w:t>
-      </w:r>
-      <w:r>
-        <w:t xml:space="preserve">no </w:t>
-      </w:r>
-      <w:r>
-        <w:t xml:space="preserve">features had clear separation. </w:t>
+        <w:t>clusters</w:t>
+      </w:r>
+      <w:r>
+        <w:t xml:space="preserve">. </w:t>
       </w:r>
       <w:r>
         <w:t xml:space="preserve">This reinforces the low Silhouette score and suggests that the white wine samples mostly share similar characteristics. </w:t>
@@ -2541,9 +2546,9 @@
         </w:rPr>
         <w:lastRenderedPageBreak/>
         <w:drawing>
-          <wp:inline distT="0" distB="0" distL="0" distR="0" wp14:anchorId="74EFA1B5" wp14:editId="707B727F">
-            <wp:extent cx="6156659" cy="5805376"/>
-            <wp:effectExtent l="0" t="0" r="0" b="5080"/>
+          <wp:inline distT="0" distB="0" distL="0" distR="0" wp14:anchorId="74EFA1B5" wp14:editId="09238E72">
+            <wp:extent cx="5715000" cy="5388917"/>
+            <wp:effectExtent l="0" t="0" r="0" b="2540"/>
             <wp:docPr id="1568426739" name="Picture 1"/>
             <wp:cNvGraphicFramePr>
               <a:graphicFrameLocks xmlns:a="http://schemas.openxmlformats.org/drawingml/2006/main" noChangeAspect="1"/>
@@ -2570,7 +2575,7 @@
                   <pic:spPr>
                     <a:xfrm>
                       <a:off x="0" y="0"/>
-                      <a:ext cx="6159759" cy="5808299"/>
+                      <a:ext cx="5721023" cy="5394596"/>
                     </a:xfrm>
                     <a:prstGeom prst="rect">
                       <a:avLst/>
@@ -2598,18 +2603,93 @@
         <w:t xml:space="preserve">a) </w:t>
       </w:r>
     </w:p>
-    <w:p/>
-    <w:p>
-      <w:r>
+    <w:p>
+      <w:r>
+        <w:t xml:space="preserve">Figure 1.5 outlines the </w:t>
+      </w:r>
+      <w:r>
+        <w:t xml:space="preserve">silhouette score and inertia of the two values. </w:t>
+      </w:r>
+      <w:proofErr w:type="spellStart"/>
+      <w:r>
+        <w:t>MinMaxScaler</w:t>
+      </w:r>
+      <w:proofErr w:type="spellEnd"/>
+      <w:r>
+        <w:t xml:space="preserve"> </w:t>
+      </w:r>
+      <w:r>
+        <w:t xml:space="preserve">performed as the better, transformation method as evidenced by the silhouette score. Inertia value did not contribute to the decision because the two methods use different methods to achieve </w:t>
+      </w:r>
+      <w:r>
+        <w:t>normalisation,</w:t>
+      </w:r>
+      <w:r>
+        <w:t xml:space="preserve"> so the values are not easily comparable. </w:t>
+      </w:r>
+    </w:p>
+    <w:p>
+      <w:r>
+        <w:drawing>
+          <wp:inline distT="0" distB="0" distL="0" distR="0" wp14:anchorId="5B13C829" wp14:editId="6289DA95">
+            <wp:extent cx="2549746" cy="1130300"/>
+            <wp:effectExtent l="0" t="0" r="3175" b="0"/>
+            <wp:docPr id="900795056" name="Picture 1"/>
+            <wp:cNvGraphicFramePr>
+              <a:graphicFrameLocks xmlns:a="http://schemas.openxmlformats.org/drawingml/2006/main" noChangeAspect="1"/>
+            </wp:cNvGraphicFramePr>
+            <a:graphic xmlns:a="http://schemas.openxmlformats.org/drawingml/2006/main">
+              <a:graphicData uri="http://schemas.openxmlformats.org/drawingml/2006/picture">
+                <pic:pic xmlns:pic="http://schemas.openxmlformats.org/drawingml/2006/picture">
+                  <pic:nvPicPr>
+                    <pic:cNvPr id="900795056" name=""/>
+                    <pic:cNvPicPr/>
+                  </pic:nvPicPr>
+                  <pic:blipFill>
+                    <a:blip r:embed="rId10"/>
+                    <a:stretch>
+                      <a:fillRect/>
+                    </a:stretch>
+                  </pic:blipFill>
+                  <pic:spPr>
+                    <a:xfrm>
+                      <a:off x="0" y="0"/>
+                      <a:ext cx="2551033" cy="1130871"/>
+                    </a:xfrm>
+                    <a:prstGeom prst="rect">
+                      <a:avLst/>
+                    </a:prstGeom>
+                  </pic:spPr>
+                </pic:pic>
+              </a:graphicData>
+            </a:graphic>
+          </wp:inline>
+        </w:drawing>
+      </w:r>
+    </w:p>
+    <w:p>
+      <w:r>
+        <w:lastRenderedPageBreak/>
         <w:t>b)</w:t>
       </w:r>
     </w:p>
     <w:p>
       <w:r>
-        <w:t xml:space="preserve">The feature distribution for the </w:t>
+        <w:t>The feature distribution</w:t>
+      </w:r>
+      <w:r>
+        <w:t xml:space="preserve"> using </w:t>
       </w:r>
       <w:proofErr w:type="spellStart"/>
       <w:r>
+        <w:t>histplot</w:t>
+      </w:r>
+      <w:proofErr w:type="spellEnd"/>
+      <w:r>
+        <w:t xml:space="preserve"> for the </w:t>
+      </w:r>
+      <w:proofErr w:type="spellStart"/>
+      <w:r>
         <w:t>MinMaxScaler</w:t>
       </w:r>
       <w:proofErr w:type="spellEnd"/>
@@ -2652,10 +2732,22 @@
         <w:t xml:space="preserve">with noticeable groupings of clusters. </w:t>
       </w:r>
       <w:r>
-        <w:t xml:space="preserve">Meanwhile fixed acidity, volatile acidity, citric acid and sulphates overlapped heavily because of minimal variation across clusters. </w:t>
-      </w:r>
-      <w:r>
-        <w:t xml:space="preserve">Cluster 0 had a noticeable higher cluster among alcohol, and a lower fixed and volatile acidity. </w:t>
+        <w:t>Meanwhile fixed acidity, volatile acidity, citric acid and sulphates overlapped heavily</w:t>
+      </w:r>
+      <w:r>
+        <w:t xml:space="preserve">, due to </w:t>
+      </w:r>
+      <w:r>
+        <w:t xml:space="preserve">minimal variation across clusters. </w:t>
+      </w:r>
+      <w:r>
+        <w:t xml:space="preserve">Cluster 0 had a </w:t>
+      </w:r>
+      <w:r>
+        <w:t>noticeably</w:t>
+      </w:r>
+      <w:r>
+        <w:t xml:space="preserve"> higher cluster among alcohol, and a lower fixed and volatile acidity. </w:t>
       </w:r>
       <w:r>
         <w:t>Meanwhile c</w:t>
@@ -2664,11 +2756,7 @@
         <w:t xml:space="preserve">luster 3 had some distinct </w:t>
       </w:r>
       <w:r>
-        <w:t xml:space="preserve">trends around the high </w:t>
-      </w:r>
-      <w:r>
-        <w:lastRenderedPageBreak/>
-        <w:t xml:space="preserve">end of residual sugar and total </w:t>
+        <w:t xml:space="preserve">trends around the high end of residual sugar and total </w:t>
       </w:r>
       <w:proofErr w:type="spellStart"/>
       <w:r>
@@ -2676,13 +2764,13 @@
       </w:r>
       <w:proofErr w:type="spellEnd"/>
       <w:r>
-        <w:t xml:space="preserve"> dioxide. </w:t>
-      </w:r>
-      <w:r>
-        <w:t xml:space="preserve">Overall, </w:t>
-      </w:r>
-      <w:r>
-        <w:t xml:space="preserve">despite some </w:t>
+        <w:t xml:space="preserve"> dioxide.</w:t>
+      </w:r>
+      <w:r>
+        <w:t xml:space="preserve"> D</w:t>
+      </w:r>
+      <w:r>
+        <w:t xml:space="preserve">espite some </w:t>
       </w:r>
       <w:r>
         <w:t>noticeable</w:t>
@@ -2703,7 +2791,13 @@
         <w:t>1931</w:t>
       </w:r>
       <w:r>
-        <w:t>,</w:t>
+        <w:t xml:space="preserve">. </w:t>
+      </w:r>
+      <w:r>
+        <w:t xml:space="preserve">This indicates that </w:t>
+      </w:r>
+      <w:r>
+        <w:t xml:space="preserve">the boundaries were poorly defined and overall clustering weak. </w:t>
       </w:r>
     </w:p>
     <w:p/>
@@ -2726,12 +2820,6 @@
     <w:p/>
     <w:p/>
     <w:p/>
-    <w:p/>
-    <w:p/>
-    <w:p/>
-    <w:p/>
-    <w:p/>
-    <w:p/>
     <w:p>
       <w:r>
         <w:lastRenderedPageBreak/>
@@ -2745,7 +2833,13 @@
     </w:p>
     <w:p>
       <w:r>
-        <w:t xml:space="preserve">The dataset was initially inspected for inconsistencies, missing values, incorrect data types, and duplicate entries. This included converting </w:t>
+        <w:t>The dataset was initially inspected for inconsistencies, missing values, incorrect data types, and duplicate entries.</w:t>
+      </w:r>
+      <w:r>
+        <w:t xml:space="preserve"> </w:t>
+      </w:r>
+      <w:r>
+        <w:t xml:space="preserve">This included converting </w:t>
       </w:r>
       <w:proofErr w:type="spellStart"/>
       <w:r>
@@ -2774,7 +2868,19 @@
       </w:r>
       <w:proofErr w:type="spellEnd"/>
       <w:r>
-        <w:t xml:space="preserve"> values were filled using matching timestamps, provided that only one transaction number corresponded to the timestamp. Missing timestamps were filled using other records from the same transaction. Where this was not possible, timestamps were estimated using the average of the preceding and following transaction timestamps, provided that the difference between them was less than 20 minutes. Daypart values were derived from the time of day, while </w:t>
+        <w:t xml:space="preserve"> values were filled using matching timestamps</w:t>
+      </w:r>
+      <w:r>
+        <w:t xml:space="preserve"> when </w:t>
+      </w:r>
+      <w:r>
+        <w:t>only one transaction number corresponded to the timestamp. Missing timestamps were filled using other records from the same transaction. Where this was not possible, timestamps were estimated using the average of the preceding and following transaction timestamps, provided that the difference between them was less than 20 minutes.</w:t>
+      </w:r>
+      <w:r>
+        <w:t xml:space="preserve"> Otherwise, entries with missing timestamps were removed.</w:t>
+      </w:r>
+      <w:r>
+        <w:t xml:space="preserve"> Daypart values were derived from the time of day, while </w:t>
       </w:r>
       <w:proofErr w:type="spellStart"/>
       <w:r>
@@ -2789,28 +2895,49 @@
       <w:r>
         <w:t xml:space="preserve">The association rule focuses on the shopping behaviour of customers not </w:t>
       </w:r>
-      <w:proofErr w:type="gramStart"/>
-      <w:r>
-        <w:t>quantities</w:t>
-      </w:r>
-      <w:proofErr w:type="gramEnd"/>
+      <w:r>
+        <w:t>quantities,</w:t>
+      </w:r>
       <w:r>
         <w:t xml:space="preserve"> so the cleaning process was primarily focused on shopping list integrity and coherency</w:t>
       </w:r>
       <w:r>
         <w:t xml:space="preserve">. </w:t>
       </w:r>
-    </w:p>
-    <w:p>
-      <w:r>
-        <w:rPr>
-          <w:noProof/>
-        </w:rPr>
+      <w:r>
+        <w:t xml:space="preserve">Figure 2.1 shows the final shape of the </w:t>
+      </w:r>
+      <w:proofErr w:type="spellStart"/>
+      <w:r>
+        <w:t>dataframe</w:t>
+      </w:r>
+      <w:proofErr w:type="spellEnd"/>
+      <w:r>
+        <w:t xml:space="preserve">. </w:t>
+      </w:r>
+      <w:r>
+        <w:t xml:space="preserve">Overall, there were 61 unique </w:t>
+      </w:r>
+      <w:r>
+        <w:t xml:space="preserve">products </w:t>
+      </w:r>
+      <w:r>
+        <w:t>with 5295 records</w:t>
+      </w:r>
+      <w:r>
+        <w:t xml:space="preserve"> (with 412 dropped)</w:t>
+      </w:r>
+      <w:r>
+        <w:t xml:space="preserve">. </w:t>
+      </w:r>
+    </w:p>
+    <w:p>
+      <w:r>
         <w:drawing>
-          <wp:inline distT="0" distB="0" distL="0" distR="0" wp14:anchorId="3B8B053D" wp14:editId="5F54D9A3">
-            <wp:extent cx="3305636" cy="1638529"/>
-            <wp:effectExtent l="0" t="0" r="0" b="0"/>
-            <wp:docPr id="1605451857" name="Picture 1"/>
+          <wp:inline distT="0" distB="0" distL="0" distR="0" wp14:anchorId="1DECE3F2" wp14:editId="23F17F40">
+            <wp:extent cx="3825572" cy="2728196"/>
+            <wp:effectExtent l="0" t="0" r="3810" b="0"/>
+            <wp:docPr id="368990996" name="Picture 1"/>
             <wp:cNvGraphicFramePr>
               <a:graphicFrameLocks xmlns:a="http://schemas.openxmlformats.org/drawingml/2006/main" noChangeAspect="1"/>
             </wp:cNvGraphicFramePr>
@@ -2818,50 +2945,7 @@
               <a:graphicData uri="http://schemas.openxmlformats.org/drawingml/2006/picture">
                 <pic:pic xmlns:pic="http://schemas.openxmlformats.org/drawingml/2006/picture">
                   <pic:nvPicPr>
-                    <pic:cNvPr id="1605451857" name=""/>
-                    <pic:cNvPicPr/>
-                  </pic:nvPicPr>
-                  <pic:blipFill>
-                    <a:blip r:embed="rId10"/>
-                    <a:stretch>
-                      <a:fillRect/>
-                    </a:stretch>
-                  </pic:blipFill>
-                  <pic:spPr>
-                    <a:xfrm>
-                      <a:off x="0" y="0"/>
-                      <a:ext cx="3305636" cy="1638529"/>
-                    </a:xfrm>
-                    <a:prstGeom prst="rect">
-                      <a:avLst/>
-                    </a:prstGeom>
-                  </pic:spPr>
-                </pic:pic>
-              </a:graphicData>
-            </a:graphic>
-          </wp:inline>
-        </w:drawing>
-      </w:r>
-    </w:p>
-    <w:p>
-      <w:r>
-        <w:rPr>
-          <w:noProof/>
-        </w:rPr>
-        <w:lastRenderedPageBreak/>
-        <w:drawing>
-          <wp:inline distT="0" distB="0" distL="0" distR="0" wp14:anchorId="2459A32B" wp14:editId="1DD55CB3">
-            <wp:extent cx="2448267" cy="3972479"/>
-            <wp:effectExtent l="0" t="0" r="9525" b="0"/>
-            <wp:docPr id="1367838256" name="Picture 1"/>
-            <wp:cNvGraphicFramePr>
-              <a:graphicFrameLocks xmlns:a="http://schemas.openxmlformats.org/drawingml/2006/main" noChangeAspect="1"/>
-            </wp:cNvGraphicFramePr>
-            <a:graphic xmlns:a="http://schemas.openxmlformats.org/drawingml/2006/main">
-              <a:graphicData uri="http://schemas.openxmlformats.org/drawingml/2006/picture">
-                <pic:pic xmlns:pic="http://schemas.openxmlformats.org/drawingml/2006/picture">
-                  <pic:nvPicPr>
-                    <pic:cNvPr id="1367838256" name=""/>
+                    <pic:cNvPr id="368990996" name=""/>
                     <pic:cNvPicPr/>
                   </pic:nvPicPr>
                   <pic:blipFill>
@@ -2873,7 +2957,7 @@
                   <pic:spPr>
                     <a:xfrm>
                       <a:off x="0" y="0"/>
-                      <a:ext cx="2448267" cy="3972479"/>
+                      <a:ext cx="3825572" cy="2728196"/>
                     </a:xfrm>
                     <a:prstGeom prst="rect">
                       <a:avLst/>
@@ -2893,6 +2977,7 @@
     </w:p>
     <w:p>
       <w:r>
+        <w:lastRenderedPageBreak/>
         <w:t>2)</w:t>
       </w:r>
     </w:p>
@@ -2920,7 +3005,10 @@
         <w:t xml:space="preserve">parameters. </w:t>
       </w:r>
       <w:r>
-        <w:t xml:space="preserve">An additional Rule column was added to make reading the direction easier. </w:t>
+        <w:t xml:space="preserve">An additional Rule column was added </w:t>
+      </w:r>
+      <w:r>
+        <w:t xml:space="preserve">for clarity. </w:t>
       </w:r>
     </w:p>
     <w:p>
@@ -2977,101 +3065,209 @@
     </w:p>
     <w:p>
       <w:r>
+        <w:t xml:space="preserve">The highest confidence value came from the rule: Medialuna -&gt; Coffee with a confidence of 0.5820. This means that 58.2% of medialuna purchases also contained coffee. </w:t>
+      </w:r>
+      <w:r>
+        <w:t>The highest lift value</w:t>
+      </w:r>
+      <w:r>
+        <w:t xml:space="preserve"> (1.2</w:t>
+      </w:r>
+      <w:r>
+        <w:t>19</w:t>
+      </w:r>
+      <w:r>
+        <w:t>)</w:t>
+      </w:r>
+      <w:r>
+        <w:t xml:space="preserve"> came from purchases that contains both coffee and Medialuna.</w:t>
+      </w:r>
+      <w:r>
+        <w:t xml:space="preserve"> </w:t>
+      </w:r>
+      <w:r>
+        <w:t xml:space="preserve">Because </w:t>
+      </w:r>
+      <w:r>
+        <w:t xml:space="preserve">Lift is </w:t>
+      </w:r>
+      <w:r>
+        <w:t xml:space="preserve">a directionless </w:t>
+      </w:r>
+      <w:r>
+        <w:t>figure,</w:t>
+      </w:r>
+      <w:r>
+        <w:t xml:space="preserve"> the same value applies to </w:t>
+      </w:r>
+      <w:r>
+        <w:t>rule</w:t>
+      </w:r>
+      <w:r>
+        <w:t>s</w:t>
+      </w:r>
+      <w:r>
+        <w:t xml:space="preserve"> coffee -&gt; </w:t>
+      </w:r>
+      <w:r>
+        <w:t xml:space="preserve">Medialuna &amp; Medialuna -&gt; coffee. </w:t>
+      </w:r>
+      <w:r>
+        <w:t xml:space="preserve"> </w:t>
+      </w:r>
+      <w:r>
+        <w:t>A</w:t>
+      </w:r>
+      <w:r>
+        <w:t xml:space="preserve">ccording to the dataset, coffee and Medialuna are purchased together 21.92% more often than if the purchases were independent. </w:t>
+      </w:r>
+    </w:p>
+    <w:p>
+      <w:r>
+        <w:t>3)</w:t>
+      </w:r>
+    </w:p>
+    <w:p>
+      <w:r>
+        <w:t xml:space="preserve">Figure X </w:t>
+      </w:r>
+      <w:r>
+        <w:t xml:space="preserve">compares the support, confidence and lift values across the association rules. </w:t>
+      </w:r>
+      <w:r>
+        <w:t xml:space="preserve">Figure </w:t>
+      </w:r>
+      <w:r>
+        <w:t>Y</w:t>
+      </w:r>
+      <w:r>
+        <w:t xml:space="preserve"> focuses on the rules with lift equal </w:t>
+      </w:r>
+      <w:r>
+        <w:t xml:space="preserve">to </w:t>
+      </w:r>
+      <w:r>
+        <w:t xml:space="preserve">or greater than 1, as these indicate that the items occur at least </w:t>
+      </w:r>
+      <w:r>
+        <w:t>as often as by chance.</w:t>
+      </w:r>
+      <w:r>
+        <w:t xml:space="preserve"> Eleven rules have a lift of 1 or greater</w:t>
+      </w:r>
+      <w:r>
+        <w:t xml:space="preserve"> </w:t>
+      </w:r>
+      <w:r>
+        <w:t xml:space="preserve">and of these </w:t>
+      </w:r>
+      <w:r>
+        <w:t xml:space="preserve">the </w:t>
+      </w:r>
+      <w:r>
+        <w:t xml:space="preserve">three </w:t>
+      </w:r>
+      <w:r>
+        <w:t xml:space="preserve">highest </w:t>
+      </w:r>
+      <w:r>
+        <w:t xml:space="preserve">lift values were from the following rules: </w:t>
+      </w:r>
+      <w:r>
+        <w:t>coffee &lt;-&gt; medialuna, coffee &lt;-&gt; pastry, sandwich</w:t>
+      </w:r>
+      <w:r>
+        <w:t xml:space="preserve"> -&gt; coffee</w:t>
+      </w:r>
+      <w:r>
+        <w:t xml:space="preserve"> (</w:t>
+      </w:r>
+      <w:r>
+        <w:t>monodirectional</w:t>
+      </w:r>
+      <w:r>
+        <w:t>)</w:t>
+      </w:r>
+      <w:r>
+        <w:t xml:space="preserve">. </w:t>
+      </w:r>
+    </w:p>
+    <w:p>
+      <w:r>
+        <w:t xml:space="preserve">medialuna </w:t>
+      </w:r>
+      <w:r>
+        <w:t xml:space="preserve">-&gt; </w:t>
+      </w:r>
+      <w:r>
+        <w:t xml:space="preserve">Coffee </w:t>
+      </w:r>
+      <w:r>
+        <w:t xml:space="preserve">was the strongest pair because they appeared in 5.4% of all transactions and 58.2% </w:t>
+      </w:r>
+      <w:r>
+        <w:t xml:space="preserve">of all medialuna purchases also include coffee. </w:t>
+      </w:r>
+      <w:r>
+        <w:t xml:space="preserve"> </w:t>
+      </w:r>
+      <w:r>
+        <w:t xml:space="preserve">Coffee and pastry </w:t>
+      </w:r>
+      <w:r>
+        <w:t>were</w:t>
+      </w:r>
+      <w:r>
+        <w:t xml:space="preserve"> a common pairing</w:t>
+      </w:r>
+      <w:r>
+        <w:t xml:space="preserve"> (support of 0.052)</w:t>
+      </w:r>
+      <w:r>
+        <w:t xml:space="preserve"> </w:t>
+      </w:r>
+      <w:r>
+        <w:t>but</w:t>
+      </w:r>
+      <w:r>
+        <w:t xml:space="preserve"> low confidence </w:t>
+      </w:r>
+      <w:r>
+        <w:t>because only about 11% of coffee purchase included pastry.</w:t>
+      </w:r>
+      <w:r>
+        <w:t xml:space="preserve"> </w:t>
+      </w:r>
+      <w:r>
+        <w:t xml:space="preserve"> </w:t>
+      </w:r>
+      <w:r>
+        <w:t>Coffee -&gt; sandwich ha</w:t>
+      </w:r>
+      <w:r>
+        <w:t>d</w:t>
+      </w:r>
+      <w:r>
+        <w:t xml:space="preserve"> a</w:t>
+      </w:r>
+      <w:r>
+        <w:t xml:space="preserve"> </w:t>
+      </w:r>
+      <w:r>
+        <w:t xml:space="preserve">confidence of </w:t>
+      </w:r>
+      <w:r>
         <w:lastRenderedPageBreak/>
-        <w:t xml:space="preserve">The highest confidence value came from the rule: Medialuna -&gt; Coffee with a confidence of 0.5820. This means that 58.2% of medialuna purchases also contained coffee. </w:t>
-      </w:r>
-      <w:r>
-        <w:t>The highest lift value came from purchases that contains both coffee and Medialuna.</w:t>
-      </w:r>
-      <w:r>
-        <w:t xml:space="preserve"> Lift is directionless so it contains the rule coffee -&gt; </w:t>
-      </w:r>
-      <w:r>
-        <w:t xml:space="preserve">Medialuna &amp; Medialuna -&gt; coffee. </w:t>
-      </w:r>
-      <w:r>
-        <w:t xml:space="preserve"> </w:t>
-      </w:r>
-      <w:r>
-        <w:t xml:space="preserve">The lift value was 1.220, which means that, according to the dataset, coffee and Medialuna are purchased together 21.92% more often than if the purchases were independent. </w:t>
-      </w:r>
-    </w:p>
-    <w:p>
-      <w:r>
-        <w:t>3)</w:t>
-      </w:r>
-    </w:p>
-    <w:p>
-      <w:r>
-        <w:t xml:space="preserve">Figure X </w:t>
-      </w:r>
-      <w:r>
-        <w:t xml:space="preserve">compares the support, confidence and lift values across the association rules. </w:t>
-      </w:r>
-      <w:r>
-        <w:t xml:space="preserve">Figure X focuses on the rules with lift equal </w:t>
-      </w:r>
-      <w:r>
-        <w:t xml:space="preserve">to </w:t>
-      </w:r>
-      <w:r>
-        <w:t xml:space="preserve">or greater than 1, as these indicate that the items occur at least </w:t>
-      </w:r>
-      <w:r>
-        <w:t xml:space="preserve">as often as by chance. </w:t>
-      </w:r>
-      <w:r>
-        <w:t xml:space="preserve">The three </w:t>
-      </w:r>
-      <w:r>
-        <w:t>positive</w:t>
-      </w:r>
-      <w:r>
-        <w:t xml:space="preserve">ly associated </w:t>
-      </w:r>
-      <w:r>
-        <w:t xml:space="preserve">lift values were from the following rules: </w:t>
-      </w:r>
-      <w:r>
-        <w:t>coffee &lt;-&gt; medialuna, coffee &lt;-&gt; pastry, sandwich</w:t>
-      </w:r>
-      <w:r>
-        <w:t xml:space="preserve"> -&gt; coffee. </w:t>
-      </w:r>
-    </w:p>
-    <w:p>
-      <w:r>
-        <w:t xml:space="preserve">Coffee </w:t>
-      </w:r>
-      <w:r>
-        <w:t>-&gt;</w:t>
-      </w:r>
-      <w:r>
-        <w:t xml:space="preserve"> medialuna is well substantiated by both support and confidence. </w:t>
-      </w:r>
-      <w:r>
-        <w:t xml:space="preserve">This means that </w:t>
-      </w:r>
-      <w:r>
-        <w:t xml:space="preserve">both appears in approximately 5.4% of all purchases, and 58% of all medialuna purchases also include coffee. </w:t>
-      </w:r>
-      <w:r>
-        <w:t xml:space="preserve"> </w:t>
-      </w:r>
-      <w:r>
-        <w:t>Coffee and pastry are also common</w:t>
-      </w:r>
-      <w:r>
-        <w:t xml:space="preserve"> but weak in the rule coffee -&gt; pastry, because only about 11% of coffee purchase included pastry. </w:t>
-      </w:r>
-      <w:r>
-        <w:t xml:space="preserve">Coffee -&gt; sandwich has a confidence of </w:t>
-      </w:r>
-      <w:r>
         <w:t>0.537,</w:t>
       </w:r>
       <w:r>
-        <w:t xml:space="preserve"> but the inverse direction is missing, potentially indicating sandwich purchases as niche, and likely filtered out by </w:t>
+        <w:t xml:space="preserve"> but the inverse direction is missing, potentially indicating sandwich purchases as </w:t>
+      </w:r>
+      <w:r>
+        <w:t>uncommon</w:t>
+      </w:r>
+      <w:r>
+        <w:t xml:space="preserve"> and likely filtered out by </w:t>
       </w:r>
       <w:proofErr w:type="spellStart"/>
       <w:r>
@@ -3138,7 +3334,6 @@
         <w:rPr>
           <w:noProof/>
         </w:rPr>
-        <w:lastRenderedPageBreak/>
         <w:drawing>
           <wp:inline distT="0" distB="0" distL="0" distR="0" wp14:anchorId="013F3F1A" wp14:editId="4954C143">
             <wp:extent cx="3381129" cy="3349256"/>
@@ -3198,10 +3393,10 @@
     </w:p>
     <w:p>
       <w:r>
-        <w:t xml:space="preserve">There were two </w:t>
-      </w:r>
-      <w:r>
-        <w:t xml:space="preserve">rules were identified, with pastry on the left side. </w:t>
+        <w:t>Two rules were identified with pastry on the left side</w:t>
+      </w:r>
+      <w:r>
+        <w:t xml:space="preserve">. </w:t>
       </w:r>
     </w:p>
     <w:p>
@@ -3258,15 +3453,114 @@
     </w:p>
     <w:p>
       <w:r>
+        <w:lastRenderedPageBreak/>
         <w:t xml:space="preserve">Based on </w:t>
       </w:r>
-      <w:proofErr w:type="spellStart"/>
-      <w:r>
-        <w:t>theresults</w:t>
-      </w:r>
-      <w:proofErr w:type="spellEnd"/>
+      <w:r>
+        <w:t>the results</w:t>
+      </w:r>
       <w:r>
         <w:t xml:space="preserve"> presented, </w:t>
+      </w:r>
+      <w:r>
+        <w:t>coffee</w:t>
+      </w:r>
+      <w:r>
+        <w:t xml:space="preserve"> </w:t>
+      </w:r>
+      <w:r>
+        <w:t xml:space="preserve">was the </w:t>
+      </w:r>
+      <w:r>
+        <w:t xml:space="preserve">most likely purchase </w:t>
+      </w:r>
+      <w:r>
+        <w:t xml:space="preserve">when they would buy </w:t>
+      </w:r>
+      <w:r>
+        <w:t>pastry</w:t>
+      </w:r>
+      <w:r>
+        <w:t xml:space="preserve">. </w:t>
+      </w:r>
+      <w:r>
+        <w:t xml:space="preserve">The rule showed a high confidence for </w:t>
+      </w:r>
+      <w:r>
+        <w:t>coffee</w:t>
+      </w:r>
+      <w:r>
+        <w:t xml:space="preserve"> at 53.6%, </w:t>
+      </w:r>
+      <w:r>
+        <w:t xml:space="preserve">compared to 32.96% for bread. This </w:t>
+      </w:r>
+      <w:r>
+        <w:t xml:space="preserve">means that 53.6% of customers who purchased pastry also bought coffee. </w:t>
+      </w:r>
+      <w:r>
+        <w:t>I</w:t>
+      </w:r>
+      <w:r>
+        <w:t xml:space="preserve">nterpreting the lift, </w:t>
+      </w:r>
+      <w:r>
+        <w:t xml:space="preserve">customers were more likely to purchase coffee with pastry 12% of the time while only 3% with bread. </w:t>
+      </w:r>
+      <w:r>
+        <w:t xml:space="preserve">This indicates that while both products have a positive association with pastry, coffee has the stronger association. </w:t>
+      </w:r>
+    </w:p>
+    <w:p>
+      <w:r>
+        <w:t xml:space="preserve">5) </w:t>
+      </w:r>
+    </w:p>
+    <w:p>
+      <w:r>
+        <w:t xml:space="preserve">Coffee should be placed </w:t>
+      </w:r>
+      <w:r>
+        <w:t>near</w:t>
+      </w:r>
+      <w:r>
+        <w:t xml:space="preserve"> </w:t>
+      </w:r>
+      <w:r>
+        <w:t>Medialuna</w:t>
+      </w:r>
+      <w:r>
+        <w:t xml:space="preserve"> to maximise sales</w:t>
+      </w:r>
+      <w:r>
+        <w:t xml:space="preserve">. </w:t>
+      </w:r>
+      <w:r>
+        <w:t>It has a strong association with</w:t>
+      </w:r>
+      <w:r>
+        <w:t xml:space="preserve"> </w:t>
+      </w:r>
+      <w:r>
+        <w:t>Medialuna</w:t>
+      </w:r>
+      <w:r>
+        <w:t xml:space="preserve"> with a</w:t>
+      </w:r>
+      <w:r>
+        <w:t xml:space="preserve"> confidence of 58.2% and lift of 1.22</w:t>
+      </w:r>
+      <w:r>
+        <w:t xml:space="preserve">. Bread would be less effective, </w:t>
+      </w:r>
+      <w:r>
+        <w:t>evidenced by its weaker support and lift value below 1</w:t>
+      </w:r>
+      <w:r>
+        <w:t>, which indicates a negative association</w:t>
+      </w:r>
+      <w:r>
+        <w:t xml:space="preserve">. </w:t>
       </w:r>
     </w:p>
     <w:p>
@@ -3309,30 +3603,6 @@
             </a:graphic>
           </wp:inline>
         </w:drawing>
-      </w:r>
-    </w:p>
-    <w:p/>
-    <w:p/>
-    <w:p/>
-    <w:p/>
-    <w:p/>
-    <w:p/>
-    <w:p/>
-    <w:p/>
-    <w:p/>
-    <w:p/>
-    <w:p/>
-    <w:p/>
-    <w:p/>
-    <w:p/>
-    <w:p/>
-    <w:p/>
-    <w:p/>
-    <w:p/>
-    <w:p/>
-    <w:p>
-      <w:r>
-        <w:t xml:space="preserve"> </w:t>
       </w:r>
     </w:p>
     <w:p/>
@@ -4140,7 +4410,6 @@
   <w:style w:type="character" w:default="1" w:styleId="DefaultParagraphFont">
     <w:name w:val="Default Paragraph Font"/>
     <w:uiPriority w:val="1"/>
-    <w:semiHidden/>
     <w:unhideWhenUsed/>
   </w:style>
   <w:style w:type="table" w:default="1" w:styleId="TableNormal">

</xml_diff>